<commit_message>
Add animated explainer slides on how Beam works and why its tokens are cheap
Slide 4 animates a token through the router to 8 of 256 experts and compares
compute with a dense model. Slide 5 builds the four cost levers one per click,
including a sliding attention window. Animations are native PowerPoint timing
added by src/animate.js. The static architecture diagram moves to an appendix
slide, GIF previews are added, and the briefing's presenter guide is updated.

Co-Authored-By: Claude Opus 5.5 <noreply@anthropic.com>
Claude-Session: https://claude.ai/code/session_0116hkPqsDi7RD6Qt38HDj1A
</commit_message>
<xml_diff>
--- a/beam-research/Beam_Executive_Briefing.docx
+++ b/beam-research/Beam_Executive_Briefing.docx
@@ -292,7 +292,7 @@
                 <w:sz w:val="18"/>
                 <w:szCs w:val="18"/>
               </w:rPr>
-              <w:t xml:space="preserve">Beam_Executive_Summary.pptx (16 slides) — this briefing follows the same storyline</w:t>
+              <w:t xml:space="preserve">Beam_Executive_Summary.pptx (18 slides, with animated explainers on slides 4–5) — this briefing follows the same storyline</w:t>
             </w:r>
           </w:p>
         </w:tc>
@@ -7846,7 +7846,7 @@
         <w:spacing w:after="120"/>
       </w:pPr>
       <w:r>
-        <w:t xml:space="preserve">Suggested timing: 25 minutes presentation + 20 minutes discussion. Slides 2, 7, 12 and 15 carry the argument; the others can be shortened if time is tight. Speaker notes with the same points are embedded in the PowerPoint file.</w:t>
+        <w:t xml:space="preserve">Suggested timing: 25 minutes presentation + 20 minutes discussion. Slides 2, 4–5, 8, 13 and 16 carry the argument; slides 4–5 are click-by-click animations — click to advance each step; the others can be shortened if time is tight. Speaker notes with the same points are embedded in the PowerPoint file.</w:t>
       </w:r>
     </w:p>
     <w:tbl>
@@ -8269,7 +8269,7 @@
                 <w:sz w:val="18"/>
                 <w:szCs w:val="18"/>
               </w:rPr>
-              <w:t xml:space="preserve">Architecture built for cheap tokens</w:t>
+              <w:t xml:space="preserve">Architecture built for cheap tokens (animated, 4 clicks)</w:t>
             </w:r>
           </w:p>
         </w:tc>
@@ -8297,7 +8297,7 @@
                 <w:sz w:val="18"/>
                 <w:szCs w:val="18"/>
               </w:rPr>
-              <w:t xml:space="preserve">Sparse experts and sparse long attention make it cheap to serve; nothing proprietary — good news for us.</w:t>
+              <w:t xml:space="preserve">Click through how one token is processed: router → 256 experts → only 8 run → ≈21× less compute than a dense model of the same size.</w:t>
             </w:r>
           </w:p>
         </w:tc>
@@ -8355,7 +8355,7 @@
                 <w:sz w:val="18"/>
                 <w:szCs w:val="18"/>
               </w:rPr>
-              <w:t xml:space="preserve">Training: post-training is the big bill</w:t>
+              <w:t xml:space="preserve">Why each token costs less (animated, 5 clicks)</w:t>
             </w:r>
           </w:p>
         </w:tc>
@@ -8383,7 +8383,7 @@
                 <w:sz w:val="18"/>
                 <w:szCs w:val="18"/>
               </w:rPr>
-              <w:t xml:space="preserve">RL used ~2–3× the GPU-hours of pre-training. Environments, not just GPUs, are the long pole.</w:t>
+              <w:t xml:space="preserve">One cost lever per click: sparse experts (21×), short memory in most layers (window slides; memory ≈17%), 4-bit weights (1.0 → 0.28 TB), drafter and ~40% fewer output tokens; then the capability trade-off.</w:t>
             </w:r>
           </w:p>
         </w:tc>
@@ -8441,7 +8441,7 @@
                 <w:sz w:val="18"/>
                 <w:szCs w:val="18"/>
               </w:rPr>
-              <w:t xml:space="preserve">On its own numbers, Beam trails open peers</w:t>
+              <w:t xml:space="preserve">Training: post-training is the big bill</w:t>
             </w:r>
           </w:p>
         </w:tc>
@@ -8469,7 +8469,7 @@
                 <w:sz w:val="18"/>
                 <w:szCs w:val="18"/>
               </w:rPr>
-              <w:t xml:space="preserve">Vendor table: level with GLM-5.2, behind Kimi K3 and Qwen 3.8 Max.</w:t>
+              <w:t xml:space="preserve">RL used ~2–3× the GPU-hours of pre-training. Environments, not just GPUs, are the long pole.</w:t>
             </w:r>
           </w:p>
         </w:tc>
@@ -8527,7 +8527,7 @@
                 <w:sz w:val="18"/>
                 <w:szCs w:val="18"/>
               </w:rPr>
-              <w:t xml:space="preserve">Independent tests: a 28-point gap</w:t>
+              <w:t xml:space="preserve">On its own numbers, Beam trails open peers</w:t>
             </w:r>
           </w:p>
         </w:tc>
@@ -8555,7 +8555,7 @@
                 <w:sz w:val="18"/>
                 <w:szCs w:val="18"/>
               </w:rPr>
-              <w:t xml:space="preserve">The key slide. Independent index: Beam 30, open leaders 44–46, closed frontier 53–58.</w:t>
+              <w:t xml:space="preserve">Vendor table: level with GLM-5.2, behind Kimi K3 and Qwen 3.8 Max.</w:t>
             </w:r>
           </w:p>
         </w:tc>
@@ -8613,7 +8613,7 @@
                 <w:sz w:val="18"/>
                 <w:szCs w:val="18"/>
               </w:rPr>
-              <w:t xml:space="preserve">The vendor landscape</w:t>
+              <w:t xml:space="preserve">Independent tests: a 28-point gap</w:t>
             </w:r>
           </w:p>
         </w:tc>
@@ -8641,7 +8641,7 @@
                 <w:sz w:val="18"/>
                 <w:szCs w:val="18"/>
               </w:rPr>
-              <w:t xml:space="preserve">Closed vendors compete on capability; Chinese labs on price; we need a third reason to exist.</w:t>
+              <w:t xml:space="preserve">The key slide. Independent index: Beam 30, open leaders 44–46, closed frontier 53–58.</w:t>
             </w:r>
           </w:p>
         </w:tc>
@@ -8699,7 +8699,7 @@
                 <w:sz w:val="18"/>
                 <w:szCs w:val="18"/>
               </w:rPr>
-              <w:t xml:space="preserve">Enterprise spend favours closed models</w:t>
+              <w:t xml:space="preserve">The vendor landscape</w:t>
             </w:r>
           </w:p>
         </w:tc>
@@ -8727,7 +8727,7 @@
                 <w:sz w:val="18"/>
                 <w:szCs w:val="18"/>
               </w:rPr>
-              <w:t xml:space="preserve">Anthropic 40%, OpenAI 27%; open share down to 11%. Growth is real but goes to the top models.</w:t>
+              <w:t xml:space="preserve">Closed vendors compete on capability; Chinese labs on price; we need a third reason to exist.</w:t>
             </w:r>
           </w:p>
         </w:tc>
@@ -8785,7 +8785,7 @@
                 <w:sz w:val="18"/>
                 <w:szCs w:val="18"/>
               </w:rPr>
-              <w:t xml:space="preserve">Where a new open model can win</w:t>
+              <w:t xml:space="preserve">Enterprise spend favours closed models</w:t>
             </w:r>
           </w:p>
         </w:tc>
@@ -8813,7 +8813,7 @@
                 <w:sz w:val="18"/>
                 <w:szCs w:val="18"/>
               </w:rPr>
-              <w:t xml:space="preserve">Six segments; ask the room which one or two we can credibly own.</w:t>
+              <w:t xml:space="preserve">Anthropic 40%, OpenAI 27%; open share down to 11%. Growth is real but goes to the top models.</w:t>
             </w:r>
           </w:p>
         </w:tc>
@@ -8871,7 +8871,7 @@
                 <w:sz w:val="18"/>
                 <w:szCs w:val="18"/>
               </w:rPr>
-              <w:t xml:space="preserve">Three levels of ambition</w:t>
+              <w:t xml:space="preserve">Where a new open model can win</w:t>
             </w:r>
           </w:p>
         </w:tc>
@@ -8899,7 +8899,7 @@
                 <w:sz w:val="18"/>
                 <w:szCs w:val="18"/>
               </w:rPr>
-              <w:t xml:space="preserve">Level 1 now; Level 2 is a funded option; Level 3 is a hyperscaler bet.</w:t>
+              <w:t xml:space="preserve">Six segments; ask the room which one or two we can credibly own.</w:t>
             </w:r>
           </w:p>
         </w:tc>
@@ -8957,7 +8957,7 @@
                 <w:sz w:val="18"/>
                 <w:szCs w:val="18"/>
               </w:rPr>
-              <w:t xml:space="preserve">Three routes to a Beam-class model</w:t>
+              <w:t xml:space="preserve">Three levels of ambition</w:t>
             </w:r>
           </w:p>
         </w:tc>
@@ -8985,7 +8985,7 @@
                 <w:sz w:val="18"/>
                 <w:szCs w:val="18"/>
               </w:rPr>
-              <w:t xml:space="preserve">A ≈ US$11M, B ≈ US$56M, C ≈ US$175M. Recommend A first.</w:t>
+              <w:t xml:space="preserve">Level 1 now; Level 2 is a funded option; Level 3 is a hyperscaler bet.</w:t>
             </w:r>
           </w:p>
         </w:tc>
@@ -9043,7 +9043,7 @@
                 <w:sz w:val="18"/>
                 <w:szCs w:val="18"/>
               </w:rPr>
-              <w:t xml:space="preserve">Staged roadmap with decision gates</w:t>
+              <w:t xml:space="preserve">Three routes to a Beam-class model</w:t>
             </w:r>
           </w:p>
         </w:tc>
@@ -9071,7 +9071,7 @@
                 <w:sz w:val="18"/>
                 <w:szCs w:val="18"/>
               </w:rPr>
-              <w:t xml:space="preserve">Gate 2 at month 9 is the real investment decision.</w:t>
+              <w:t xml:space="preserve">A ≈ US$11M, B ≈ US$56M, C ≈ US$175M. Recommend A first.</w:t>
             </w:r>
           </w:p>
         </w:tc>
@@ -9129,7 +9129,7 @@
                 <w:sz w:val="18"/>
                 <w:szCs w:val="18"/>
               </w:rPr>
-              <w:t xml:space="preserve">Key risks and how we manage them</w:t>
+              <w:t xml:space="preserve">Staged roadmap with decision gates</w:t>
             </w:r>
           </w:p>
         </w:tc>
@@ -9157,7 +9157,7 @@
                 <w:sz w:val="18"/>
                 <w:szCs w:val="18"/>
               </w:rPr>
-              <w:t xml:space="preserve">Biggest risks are strategic (moving frontier, price war) and RL infrastructure.</w:t>
+              <w:t xml:space="preserve">Gate 2 at month 9 is the real investment decision.</w:t>
             </w:r>
           </w:p>
         </w:tc>
@@ -9215,7 +9215,7 @@
                 <w:sz w:val="18"/>
                 <w:szCs w:val="18"/>
               </w:rPr>
-              <w:t xml:space="preserve">Recommendation and next steps</w:t>
+              <w:t xml:space="preserve">Key risks and how we manage them</w:t>
             </w:r>
           </w:p>
         </w:tc>
@@ -9243,7 +9243,7 @@
                 <w:sz w:val="18"/>
                 <w:szCs w:val="18"/>
               </w:rPr>
-              <w:t xml:space="preserve">Ask for approval of Stage 1 and the segment choice.</w:t>
+              <w:t xml:space="preserve">Biggest risks are strategic (moving frontier, price war) and RL infrastructure.</w:t>
             </w:r>
           </w:p>
         </w:tc>
@@ -9274,6 +9274,178 @@
                 <w:szCs w:val="18"/>
               </w:rPr>
               <w:t xml:space="preserve">16</w:t>
+            </w:r>
+          </w:p>
+        </w:tc>
+        <w:tc>
+          <w:tcPr>
+            <w:tcW w:type="dxa" w:w="3000"/>
+            <w:tcBorders>
+              <w:top w:val="single" w:color="D0CFC8" w:sz="4"/>
+              <w:left w:val="single" w:color="D0CFC8" w:sz="4"/>
+              <w:bottom w:val="single" w:color="D0CFC8" w:sz="4"/>
+              <w:right w:val="single" w:color="D0CFC8" w:sz="4"/>
+            </w:tcBorders>
+            <w:tcMar>
+              <w:top w:type="dxa" w:w="60"/>
+              <w:left w:type="dxa" w:w="100"/>
+              <w:bottom w:type="dxa" w:w="60"/>
+              <w:right w:type="dxa" w:w="100"/>
+            </w:tcMar>
+          </w:tcPr>
+          <w:p>
+            <w:r>
+              <w:rPr>
+                <w:b w:val="false"/>
+                <w:bCs w:val="false"/>
+                <w:sz w:val="18"/>
+                <w:szCs w:val="18"/>
+              </w:rPr>
+              <w:t xml:space="preserve">Recommendation and next steps</w:t>
+            </w:r>
+          </w:p>
+        </w:tc>
+        <w:tc>
+          <w:tcPr>
+            <w:tcW w:type="dxa" w:w="5560"/>
+            <w:tcBorders>
+              <w:top w:val="single" w:color="D0CFC8" w:sz="4"/>
+              <w:left w:val="single" w:color="D0CFC8" w:sz="4"/>
+              <w:bottom w:val="single" w:color="D0CFC8" w:sz="4"/>
+              <w:right w:val="single" w:color="D0CFC8" w:sz="4"/>
+            </w:tcBorders>
+            <w:tcMar>
+              <w:top w:type="dxa" w:w="60"/>
+              <w:left w:type="dxa" w:w="100"/>
+              <w:bottom w:type="dxa" w:w="60"/>
+              <w:right w:type="dxa" w:w="100"/>
+            </w:tcMar>
+          </w:tcPr>
+          <w:p>
+            <w:r>
+              <w:rPr>
+                <w:b w:val="false"/>
+                <w:bCs w:val="false"/>
+                <w:sz w:val="18"/>
+                <w:szCs w:val="18"/>
+              </w:rPr>
+              <w:t xml:space="preserve">Ask for approval of Stage 1 and the segment choice.</w:t>
+            </w:r>
+          </w:p>
+        </w:tc>
+      </w:tr>
+      <w:tr>
+        <w:tc>
+          <w:tcPr>
+            <w:tcW w:type="dxa" w:w="800"/>
+            <w:tcBorders>
+              <w:top w:val="single" w:color="D0CFC8" w:sz="4"/>
+              <w:left w:val="single" w:color="D0CFC8" w:sz="4"/>
+              <w:bottom w:val="single" w:color="D0CFC8" w:sz="4"/>
+              <w:right w:val="single" w:color="D0CFC8" w:sz="4"/>
+            </w:tcBorders>
+            <w:tcMar>
+              <w:top w:type="dxa" w:w="60"/>
+              <w:left w:type="dxa" w:w="100"/>
+              <w:bottom w:type="dxa" w:w="60"/>
+              <w:right w:type="dxa" w:w="100"/>
+            </w:tcMar>
+          </w:tcPr>
+          <w:p>
+            <w:r>
+              <w:rPr>
+                <w:b w:val="false"/>
+                <w:bCs w:val="false"/>
+                <w:sz w:val="18"/>
+                <w:szCs w:val="18"/>
+              </w:rPr>
+              <w:t xml:space="preserve">17</w:t>
+            </w:r>
+          </w:p>
+        </w:tc>
+        <w:tc>
+          <w:tcPr>
+            <w:tcW w:type="dxa" w:w="3000"/>
+            <w:tcBorders>
+              <w:top w:val="single" w:color="D0CFC8" w:sz="4"/>
+              <w:left w:val="single" w:color="D0CFC8" w:sz="4"/>
+              <w:bottom w:val="single" w:color="D0CFC8" w:sz="4"/>
+              <w:right w:val="single" w:color="D0CFC8" w:sz="4"/>
+            </w:tcBorders>
+            <w:tcMar>
+              <w:top w:type="dxa" w:w="60"/>
+              <w:left w:type="dxa" w:w="100"/>
+              <w:bottom w:type="dxa" w:w="60"/>
+              <w:right w:type="dxa" w:w="100"/>
+            </w:tcMar>
+          </w:tcPr>
+          <w:p>
+            <w:r>
+              <w:rPr>
+                <w:b w:val="false"/>
+                <w:bCs w:val="false"/>
+                <w:sz w:val="18"/>
+                <w:szCs w:val="18"/>
+              </w:rPr>
+              <w:t xml:space="preserve">Appendix: Beam architecture detail</w:t>
+            </w:r>
+          </w:p>
+        </w:tc>
+        <w:tc>
+          <w:tcPr>
+            <w:tcW w:type="dxa" w:w="5560"/>
+            <w:tcBorders>
+              <w:top w:val="single" w:color="D0CFC8" w:sz="4"/>
+              <w:left w:val="single" w:color="D0CFC8" w:sz="4"/>
+              <w:bottom w:val="single" w:color="D0CFC8" w:sz="4"/>
+              <w:right w:val="single" w:color="D0CFC8" w:sz="4"/>
+            </w:tcBorders>
+            <w:tcMar>
+              <w:top w:type="dxa" w:w="60"/>
+              <w:left w:type="dxa" w:w="100"/>
+              <w:bottom w:type="dxa" w:w="60"/>
+              <w:right w:type="dxa" w:w="100"/>
+            </w:tcMar>
+          </w:tcPr>
+          <w:p>
+            <w:r>
+              <w:rPr>
+                <w:b w:val="false"/>
+                <w:bCs w:val="false"/>
+                <w:sz w:val="18"/>
+                <w:szCs w:val="18"/>
+              </w:rPr>
+              <w:t xml:space="preserve">Full technical diagram, for questions.</w:t>
+            </w:r>
+          </w:p>
+        </w:tc>
+      </w:tr>
+      <w:tr>
+        <w:tc>
+          <w:tcPr>
+            <w:tcW w:type="dxa" w:w="800"/>
+            <w:tcBorders>
+              <w:top w:val="single" w:color="D0CFC8" w:sz="4"/>
+              <w:left w:val="single" w:color="D0CFC8" w:sz="4"/>
+              <w:bottom w:val="single" w:color="D0CFC8" w:sz="4"/>
+              <w:right w:val="single" w:color="D0CFC8" w:sz="4"/>
+            </w:tcBorders>
+            <w:tcMar>
+              <w:top w:type="dxa" w:w="60"/>
+              <w:left w:type="dxa" w:w="100"/>
+              <w:bottom w:type="dxa" w:w="60"/>
+              <w:right w:type="dxa" w:w="100"/>
+            </w:tcMar>
+          </w:tcPr>
+          <w:p>
+            <w:r>
+              <w:rPr>
+                <w:b w:val="false"/>
+                <w:bCs w:val="false"/>
+                <w:sz w:val="18"/>
+                <w:szCs w:val="18"/>
+              </w:rPr>
+              <w:t xml:space="preserve">18</w:t>
             </w:r>
           </w:p>
         </w:tc>
@@ -9353,7 +9525,7 @@
         </w:numPr>
         <w:spacing w:after="60"/>
       </w:pPr>
-      <w:hyperlink w:history="1" r:id="rIdeqdrn_4fhkrpdk7gzp4uw">
+      <w:hyperlink w:history="1" r:id="rIdqchkpnxlyfktfsvbac4yo">
         <w:r>
           <w:rPr>
             <w:rStyle w:val="Hyperlink"/>
@@ -9371,7 +9543,7 @@
         </w:numPr>
         <w:spacing w:after="60"/>
       </w:pPr>
-      <w:hyperlink w:history="1" r:id="rIdlnec_fk1pax26zi9qnhat">
+      <w:hyperlink w:history="1" r:id="rId1ujeov3xlq17lals-6y_l">
         <w:r>
           <w:rPr>
             <w:rStyle w:val="Hyperlink"/>
@@ -9389,7 +9561,7 @@
         </w:numPr>
         <w:spacing w:after="60"/>
       </w:pPr>
-      <w:hyperlink w:history="1" r:id="rIdy55ie09bpxtdjsrf62xbd">
+      <w:hyperlink w:history="1" r:id="rIdc_rkico5it7k_ux3r7lfe">
         <w:r>
           <w:rPr>
             <w:rStyle w:val="Hyperlink"/>
@@ -9407,7 +9579,7 @@
         </w:numPr>
         <w:spacing w:after="60"/>
       </w:pPr>
-      <w:hyperlink w:history="1" r:id="rIdesb77hjdrf3q6ia7tsozz">
+      <w:hyperlink w:history="1" r:id="rIdbobxssw87whqr8royyz99">
         <w:r>
           <w:rPr>
             <w:rStyle w:val="Hyperlink"/>
@@ -9425,7 +9597,7 @@
         </w:numPr>
         <w:spacing w:after="60"/>
       </w:pPr>
-      <w:hyperlink w:history="1" r:id="rIdylsirup88cpzpegkm-rjt">
+      <w:hyperlink w:history="1" r:id="rIdstzj4kbgvn4gsodt9tjhj">
         <w:r>
           <w:rPr>
             <w:rStyle w:val="Hyperlink"/>
@@ -9443,7 +9615,7 @@
         </w:numPr>
         <w:spacing w:after="60"/>
       </w:pPr>
-      <w:hyperlink w:history="1" r:id="rId-q03sdiuvmf1zfdqzvja0">
+      <w:hyperlink w:history="1" r:id="rIdzfaf50qxfy3ph4ewfnkye">
         <w:r>
           <w:rPr>
             <w:rStyle w:val="Hyperlink"/>
@@ -9461,7 +9633,7 @@
         </w:numPr>
         <w:spacing w:after="60"/>
       </w:pPr>
-      <w:hyperlink w:history="1" r:id="rIdylezfsl1gxygrsgv1jsbd">
+      <w:hyperlink w:history="1" r:id="rId6v4ly-nv4mi34yjnybb04">
         <w:r>
           <w:rPr>
             <w:rStyle w:val="Hyperlink"/>
@@ -9479,7 +9651,7 @@
         </w:numPr>
         <w:spacing w:after="60"/>
       </w:pPr>
-      <w:hyperlink w:history="1" r:id="rIdmw1fff9qkhk52naiwimzd">
+      <w:hyperlink w:history="1" r:id="rIdyvvwovod1zkuribqjnfxb">
         <w:r>
           <w:rPr>
             <w:rStyle w:val="Hyperlink"/>
@@ -9497,7 +9669,7 @@
         </w:numPr>
         <w:spacing w:after="60"/>
       </w:pPr>
-      <w:hyperlink w:history="1" r:id="rIdn8w6okzq-qzvwytj2vbpg">
+      <w:hyperlink w:history="1" r:id="rIdwxz4b56mskvgrpjeelv2m">
         <w:r>
           <w:rPr>
             <w:rStyle w:val="Hyperlink"/>
@@ -9515,7 +9687,7 @@
         </w:numPr>
         <w:spacing w:after="60"/>
       </w:pPr>
-      <w:hyperlink w:history="1" r:id="rId_gsalscqezgi_pwwgqdr2">
+      <w:hyperlink w:history="1" r:id="rIdfwakxb5orwbu9pmkv0zbo">
         <w:r>
           <w:rPr>
             <w:rStyle w:val="Hyperlink"/>

</xml_diff>